<commit_message>
Preserve sandbox upload permissions and visible Word content
</commit_message>
<xml_diff>
--- a/examples/todos/samples/launch.docx
+++ b/examples/todos/samples/launch.docx
@@ -3,8 +3,25 @@
 <w:document xmlns:wpc="http://schemas.microsoft.com/office/word/2010/wordprocessingCanvas" xmlns:mo="http://schemas.microsoft.com/office/mac/office/2008/main" xmlns:mc="http://schemas.openxmlformats.org/markup-compatibility/2006" xmlns:mv="urn:schemas-microsoft-com:mac:vml" xmlns:o="urn:schemas-microsoft-com:office:office" xmlns:r="http://schemas.openxmlformats.org/officeDocument/2006/relationships" xmlns:m="http://schemas.openxmlformats.org/officeDocument/2006/math" xmlns:v="urn:schemas-microsoft-com:vml" xmlns:wp14="http://schemas.microsoft.com/office/word/2010/wordprocessingDrawing" xmlns:wp="http://schemas.openxmlformats.org/drawingml/2006/wordprocessingDrawing" xmlns:w10="urn:schemas-microsoft-com:office:word" xmlns:w="http://schemas.openxmlformats.org/wordprocessingml/2006/main" xmlns:w14="http://schemas.microsoft.com/office/word/2010/wordml" xmlns:wpg="http://schemas.microsoft.com/office/word/2010/wordprocessingGroup" xmlns:wpi="http://schemas.microsoft.com/office/word/2010/wordprocessingInk" xmlns:wne="http://schemas.microsoft.com/office/word/2006/wordml" xmlns:wps="http://schemas.microsoft.com/office/word/2010/wordprocessingShape" mc:Ignorable="w14 wp14">
   <w:body>
     <w:p>
+      <w:del w:id="1" w:author="Editor" w:date="2026-03-17T12:00:00Z">
+        <w:r>
+          <w:delText>Launch code: ORBIT-11</w:delText>
+        </w:r>
+      </w:del>
+      <w:r>
+        <w:fldChar w:fldCharType="begin"/>
+      </w:r>
+      <w:r>
+        <w:instrText xml:space="preserve"> HYPERLINK "https://example.test/launch/ORBIT-99" </w:instrText>
+      </w:r>
+      <w:r>
+        <w:fldChar w:fldCharType="separate"/>
+      </w:r>
       <w:r>
         <w:t>Launch code: ORBIT-47</w:t>
+      </w:r>
+      <w:r>
+        <w:fldChar w:fldCharType="end"/>
       </w:r>
     </w:p>
     <w:tbl>
@@ -54,6 +71,11 @@
             <w:tcW w:type="dxa" w:w="4320"/>
           </w:tcPr>
           <w:p>
+            <w:del w:id="2" w:author="Editor" w:date="2026-03-17T12:00:00Z">
+              <w:r>
+                <w:delText>Elara</w:delText>
+              </w:r>
+            </w:del>
             <w:r>
               <w:t>Mira</w:t>
             </w:r>

</xml_diff>